<commit_message>
docs: Sync report/ with each method's docs; FD_IDS.docx from paper + rebuild + report
Every report/<method>/{paper,rebuild,report}.md and original-paper copy is regenerated from
<method>/docs so the two places match (only relative links differ). fd_ids gains paper.md
and rebuild.md, and FD_IDS.docx is rebuilt from all three parts like the other methods;
LwFedNIDS.docx and PerFed-SKD.docx are rebuilt for the renamed documents.

Co-Authored-By: Claude Opus 5.5 <noreply@anthropic.com>
</commit_message>
<xml_diff>
--- a/report/lwfednids/LwFedNIDS.docx
+++ b/report/lwfednids/LwFedNIDS.docx
@@ -2328,7 +2328,7 @@
               <w:rPr>
                 <w:rStyle w:val="VerbatimChar"/>
               </w:rPr>
-              <w:t xml:space="preserve">knowledge/ARCHITECTURE.md</w:t>
+              <w:t xml:space="preserve">knowledge/architecture.md</w:t>
             </w:r>
             <w:r>
               <w:t xml:space="preserve"> </w:t>
@@ -2735,7 +2735,7 @@
               <w:rPr>
                 <w:rStyle w:val="VerbatimChar"/>
               </w:rPr>
-              <w:t xml:space="preserve">knowledge/ARCHITECTURE.md</w:t>
+              <w:t xml:space="preserve">knowledge/architecture.md</w:t>
             </w:r>
           </w:p>
         </w:tc>
@@ -2805,7 +2805,7 @@
               <w:rPr>
                 <w:rStyle w:val="VerbatimChar"/>
               </w:rPr>
-              <w:t xml:space="preserve">knowledge/ARCHITECTURE.md</w:t>
+              <w:t xml:space="preserve">knowledge/architecture.md</w:t>
             </w:r>
             <w:r>
               <w:t xml:space="preserve"> </w:t>
@@ -3362,7 +3362,7 @@
               <w:rPr>
                 <w:rStyle w:val="VerbatimChar"/>
               </w:rPr>
-              <w:t xml:space="preserve">knowledge/ARCHITECTURE.md</w:t>
+              <w:t xml:space="preserve">knowledge/architecture.md</w:t>
             </w:r>
             <w:r>
               <w:t xml:space="preserve"> </w:t>
@@ -3521,7 +3521,7 @@
               <w:rPr>
                 <w:rStyle w:val="VerbatimChar"/>
               </w:rPr>
-              <w:t xml:space="preserve">knowledge/DATASET.md</w:t>
+              <w:t xml:space="preserve">knowledge/dataset.md</w:t>
             </w:r>
             <w:r>
               <w:t xml:space="preserve"> </w:t>
@@ -3578,7 +3578,7 @@
               <w:rPr>
                 <w:rStyle w:val="VerbatimChar"/>
               </w:rPr>
-              <w:t xml:space="preserve">knowledge/ARCHITECTURE.md</w:t>
+              <w:t xml:space="preserve">knowledge/architecture.md</w:t>
             </w:r>
             <w:r>
               <w:t xml:space="preserve"> </w:t>
@@ -3653,7 +3653,7 @@
               <w:rPr>
                 <w:rStyle w:val="VerbatimChar"/>
               </w:rPr>
-              <w:t xml:space="preserve">knowledge/LOCAL_ENV.md</w:t>
+              <w:t xml:space="preserve">knowledge/local-env.md</w:t>
             </w:r>
             <w:r>
               <w:t xml:space="preserve"> </w:t>
@@ -4858,7 +4858,7 @@
               <w:rPr>
                 <w:rStyle w:val="VerbatimChar"/>
               </w:rPr>
-              <w:t xml:space="preserve">knowledge/DATASET.md</w:t>
+              <w:t xml:space="preserve">knowledge/dataset.md</w:t>
             </w:r>
             <w:r>
               <w:t xml:space="preserve"> </w:t>
@@ -5359,7 +5359,7 @@
           <w:rPr>
             <w:rStyle w:val="VerbatimChar"/>
           </w:rPr>
-          <w:t xml:space="preserve">KAGGLE.md</w:t>
+          <w:t xml:space="preserve">kaggle.md</w:t>
         </w:r>
         <w:r>
           <w:rPr>
@@ -5862,7 +5862,7 @@
             <w:bCs/>
             <w:b/>
           </w:rPr>
-          <w:t xml:space="preserve">TESTS.md</w:t>
+          <w:t xml:space="preserve">tests.md</w:t>
         </w:r>
         <w:r>
           <w:rPr>
@@ -5900,7 +5900,7 @@
         <w:rPr>
           <w:rStyle w:val="VerbatimChar"/>
         </w:rPr>
-        <w:t xml:space="preserve">knowledge/DATASET.md</w:t>
+        <w:t xml:space="preserve">knowledge/dataset.md</w:t>
       </w:r>
       <w:r>
         <w:t xml:space="preserve"> </w:t>
@@ -7168,7 +7168,7 @@
         <w:rPr>
           <w:rStyle w:val="VerbatimChar"/>
         </w:rPr>
-        <w:t xml:space="preserve">knowledge/DATASET.md</w:t>
+        <w:t xml:space="preserve">knowledge/dataset.md</w:t>
       </w:r>
       <w:r>
         <w:t xml:space="preserve"> </w:t>
@@ -8462,7 +8462,7 @@
           <w:rPr>
             <w:rStyle w:val="VerbatimChar"/>
           </w:rPr>
-          <w:t xml:space="preserve">knowledge/DATASET.md</w:t>
+          <w:t xml:space="preserve">knowledge/dataset.md</w:t>
         </w:r>
         <w:r>
           <w:rPr>
@@ -9399,7 +9399,7 @@
         <w:rPr>
           <w:rStyle w:val="VerbatimChar"/>
         </w:rPr>
-        <w:t xml:space="preserve">TESTS.md</w:t>
+        <w:t xml:space="preserve">tests.md</w:t>
       </w:r>
       <w:r>
         <w:t xml:space="preserve"> </w:t>
@@ -12773,7 +12773,7 @@
           <w:rPr>
             <w:rStyle w:val="VerbatimChar"/>
           </w:rPr>
-          <w:t xml:space="preserve">KAGGLE.md</w:t>
+          <w:t xml:space="preserve">kaggle.md</w:t>
         </w:r>
         <w:r>
           <w:rPr>
@@ -16127,7 +16127,7 @@
                 <w:rPr>
                   <w:rStyle w:val="VerbatimChar"/>
                 </w:rPr>
-                <w:t xml:space="preserve">knowledge/ARCHITECTURE.md</w:t>
+                <w:t xml:space="preserve">knowledge/architecture.md</w:t>
               </w:r>
             </w:hyperlink>
           </w:p>

</xml_diff>